<commit_message>
Update SQL Queries List 100+.docx
</commit_message>
<xml_diff>
--- a/SQL Queries List 100+.docx
+++ b/SQL Queries List 100+.docx
@@ -2524,6 +2524,29 @@
         <w:t>ON e.manager_id = m.emp_id;</w:t>
       </w:r>
     </w:p>
+    <w:p/>
+    <w:p>
+      <w:r>
+        <w:t>LEFT JOIN is used because some employees may not have a manager.</w:t>
+      </w:r>
+    </w:p>
+    <w:p>
+      <w:r>
+        <w:t>Example:</w:t>
+      </w:r>
+    </w:p>
+    <w:p>
+      <w:pPr>
+        <w:numPr>
+          <w:ilvl w:val="0"/>
+          <w:numId w:val="7"/>
+        </w:numPr>
+      </w:pPr>
+      <w:r>
+        <w:t>CEO / Director / Top-level manager often has manager_id = NULL.</w:t>
+      </w:r>
+    </w:p>
+    <w:p/>
     <w:p>
       <w:pPr>
         <w:rPr>
@@ -2537,42 +2560,6 @@
           <w:bCs/>
         </w:rPr>
         <w:t>39. Employees earning more than their manager</w:t>
-      </w:r>
-    </w:p>
-    <w:p>
-      <w:r>
-        <w:t>SELECT e.name</w:t>
-      </w:r>
-      <w:r>
-        <w:br/>
-        <w:t>FROM employees e</w:t>
-      </w:r>
-      <w:r>
-        <w:br/>
-        <w:t>JOIN employees m</w:t>
-      </w:r>
-      <w:r>
-        <w:br/>
-        <w:t>ON e.manager_id = m.emp_id</w:t>
-      </w:r>
-      <w:r>
-        <w:br/>
-        <w:t>WHERE e.salary &gt; m.salary;</w:t>
-      </w:r>
-    </w:p>
-    <w:p>
-      <w:pPr>
-        <w:rPr>
-          <w:b/>
-          <w:bCs/>
-        </w:rPr>
-      </w:pPr>
-      <w:r>
-        <w:rPr>
-          <w:b/>
-          <w:bCs/>
-        </w:rPr>
-        <w:t>40. Employees hired after manager</w:t>
       </w:r>
     </w:p>
     <w:p>
@@ -2594,6 +2581,42 @@
       </w:r>
       <w:r>
         <w:br/>
+        <w:t>WHERE e.salary &gt; m.salary;</w:t>
+      </w:r>
+    </w:p>
+    <w:p>
+      <w:pPr>
+        <w:rPr>
+          <w:b/>
+          <w:bCs/>
+        </w:rPr>
+      </w:pPr>
+      <w:r>
+        <w:rPr>
+          <w:b/>
+          <w:bCs/>
+        </w:rPr>
+        <w:t>40. Employees hired after manager</w:t>
+      </w:r>
+    </w:p>
+    <w:p>
+      <w:r>
+        <w:t>SELECT e.name</w:t>
+      </w:r>
+      <w:r>
+        <w:br/>
+        <w:t>FROM employees e</w:t>
+      </w:r>
+      <w:r>
+        <w:br/>
+        <w:t>JOIN employees m</w:t>
+      </w:r>
+      <w:r>
+        <w:br/>
+        <w:t>ON e.manager_id = m.emp_id</w:t>
+      </w:r>
+      <w:r>
+        <w:br/>
         <w:t>WHERE e.hire_date &gt; m.hire_date;</w:t>
       </w:r>
     </w:p>
@@ -2746,6 +2769,9 @@
       </w:r>
       <w:r>
         <w:br/>
+      </w:r>
+      <w:r>
+        <w:lastRenderedPageBreak/>
         <w:t>GROUP BY c.name</w:t>
       </w:r>
       <w:r>
@@ -2782,9 +2808,6 @@
       </w:r>
       <w:r>
         <w:br/>
-      </w:r>
-      <w:r>
-        <w:lastRenderedPageBreak/>
         <w:t>ON c.customer_id = o.customer_id</w:t>
       </w:r>
       <w:r>
@@ -2963,6 +2986,9 @@
       </w:r>
       <w:r>
         <w:br/>
+      </w:r>
+      <w:r>
+        <w:lastRenderedPageBreak/>
         <w:t xml:space="preserve">    SELECT MAX(salary)</w:t>
       </w:r>
       <w:r>
@@ -2999,14 +3025,210 @@
       </w:r>
       <w:r>
         <w:br/>
+        <w:t>WHERE salary = (</w:t>
+      </w:r>
+      <w:r>
+        <w:br/>
+        <w:t xml:space="preserve">    SELECT MIN(salary)</w:t>
+      </w:r>
+      <w:r>
+        <w:br/>
+        <w:t xml:space="preserve">    FROM employees</w:t>
+      </w:r>
+      <w:r>
+        <w:br/>
+        <w:t>);</w:t>
+      </w:r>
+    </w:p>
+    <w:p>
+      <w:pPr>
+        <w:rPr>
+          <w:b/>
+          <w:bCs/>
+        </w:rPr>
+      </w:pPr>
+      <w:r>
+        <w:rPr>
+          <w:b/>
+          <w:bCs/>
+        </w:rPr>
+        <w:t>51. Employees whose salary greater than department average</w:t>
+      </w:r>
+    </w:p>
+    <w:p>
+      <w:r>
+        <w:t>SELECT *</w:t>
+      </w:r>
+      <w:r>
+        <w:br/>
+        <w:t>FROM employees e</w:t>
+      </w:r>
+      <w:r>
+        <w:br/>
+        <w:t>WHERE salary &gt; (</w:t>
+      </w:r>
+      <w:r>
+        <w:br/>
+        <w:t xml:space="preserve">    SELECT AVG(salary)</w:t>
+      </w:r>
+      <w:r>
+        <w:br/>
+        <w:t xml:space="preserve">    FROM employees</w:t>
+      </w:r>
+      <w:r>
+        <w:br/>
+        <w:t xml:space="preserve">    WHERE dept = e.dept</w:t>
+      </w:r>
+      <w:r>
+        <w:br/>
+        <w:t>);</w:t>
+      </w:r>
+    </w:p>
+    <w:p>
+      <w:pPr>
+        <w:rPr>
+          <w:b/>
+          <w:bCs/>
+        </w:rPr>
+      </w:pPr>
+      <w:r>
+        <w:rPr>
+          <w:b/>
+          <w:bCs/>
+        </w:rPr>
+        <w:t>52. Departments with highest average salary</w:t>
+      </w:r>
+    </w:p>
+    <w:p>
+      <w:r>
+        <w:t>SELECT dept</w:t>
+      </w:r>
+      <w:r>
+        <w:br/>
+        <w:t>FROM employees</w:t>
+      </w:r>
+      <w:r>
+        <w:br/>
+        <w:t>GROUP BY dept</w:t>
+      </w:r>
+      <w:r>
+        <w:br/>
+        <w:t>ORDER BY AVG(salary) DESC</w:t>
+      </w:r>
+      <w:r>
+        <w:br/>
+        <w:t>LIMIT 1;</w:t>
+      </w:r>
+    </w:p>
+    <w:p>
+      <w:pPr>
+        <w:rPr>
+          <w:b/>
+          <w:bCs/>
+        </w:rPr>
+      </w:pPr>
+      <w:r>
+        <w:rPr>
+          <w:b/>
+          <w:bCs/>
+        </w:rPr>
+        <w:t>53. Customers with orders above average order value</w:t>
+      </w:r>
+    </w:p>
+    <w:p>
+      <w:r>
+        <w:t>SELECT *</w:t>
+      </w:r>
+      <w:r>
+        <w:br/>
+        <w:t>FROM orders</w:t>
+      </w:r>
+      <w:r>
+        <w:br/>
+        <w:t>WHERE amount &gt; (</w:t>
+      </w:r>
+      <w:r>
+        <w:br/>
+        <w:t xml:space="preserve">    SELECT AVG(amount)</w:t>
+      </w:r>
+      <w:r>
+        <w:br/>
+        <w:t xml:space="preserve">    FROM orders</w:t>
+      </w:r>
+      <w:r>
+        <w:br/>
+        <w:t>);</w:t>
+      </w:r>
+    </w:p>
+    <w:p>
+      <w:pPr>
+        <w:rPr>
+          <w:b/>
+          <w:bCs/>
+        </w:rPr>
+      </w:pPr>
+      <w:r>
+        <w:rPr>
+          <w:b/>
+          <w:bCs/>
+        </w:rPr>
+        <w:t>54. Customers with highest purchase</w:t>
+      </w:r>
+    </w:p>
+    <w:p>
+      <w:r>
+        <w:t>SELECT customer_id</w:t>
+      </w:r>
+      <w:r>
+        <w:br/>
+        <w:t>FROM orders</w:t>
+      </w:r>
+      <w:r>
+        <w:br/>
+        <w:t>GROUP BY customer_id</w:t>
+      </w:r>
+      <w:r>
+        <w:br/>
       </w:r>
       <w:r>
         <w:lastRenderedPageBreak/>
-        <w:t>WHERE salary = (</w:t>
-      </w:r>
-      <w:r>
-        <w:br/>
-        <w:t xml:space="preserve">    SELECT MIN(salary)</w:t>
+        <w:t>ORDER BY SUM(amount) DESC</w:t>
+      </w:r>
+      <w:r>
+        <w:br/>
+        <w:t>LIMIT 1;</w:t>
+      </w:r>
+    </w:p>
+    <w:p>
+      <w:pPr>
+        <w:rPr>
+          <w:b/>
+          <w:bCs/>
+        </w:rPr>
+      </w:pPr>
+      <w:r>
+        <w:rPr>
+          <w:b/>
+          <w:bCs/>
+        </w:rPr>
+        <w:t>55. Employees hired after company average hire date</w:t>
+      </w:r>
+    </w:p>
+    <w:p>
+      <w:r>
+        <w:t>SELECT *</w:t>
+      </w:r>
+      <w:r>
+        <w:br/>
+        <w:t>FROM employees</w:t>
+      </w:r>
+      <w:r>
+        <w:br/>
+        <w:t>WHERE hire_date &gt; (</w:t>
+      </w:r>
+      <w:r>
+        <w:br/>
+        <w:t xml:space="preserve">    SELECT AVG(hire_date)</w:t>
       </w:r>
       <w:r>
         <w:br/>
@@ -3029,7 +3251,7 @@
           <w:b/>
           <w:bCs/>
         </w:rPr>
-        <w:t>51. Employees whose salary greater than department average</w:t>
+        <w:t>56. Employees earning more than department maximum of another department</w:t>
       </w:r>
     </w:p>
     <w:p>
@@ -3038,373 +3260,177 @@
       </w:r>
       <w:r>
         <w:br/>
+        <w:t>FROM employees</w:t>
+      </w:r>
+      <w:r>
+        <w:br/>
+        <w:t>WHERE salary &gt; (</w:t>
+      </w:r>
+      <w:r>
+        <w:br/>
+        <w:t xml:space="preserve">    SELECT MAX(salary)</w:t>
+      </w:r>
+      <w:r>
+        <w:br/>
+        <w:t xml:space="preserve">    FROM employees</w:t>
+      </w:r>
+      <w:r>
+        <w:br/>
+        <w:t xml:space="preserve">    WHERE dept = 'HR'</w:t>
+      </w:r>
+      <w:r>
+        <w:br/>
+        <w:t>);</w:t>
+      </w:r>
+    </w:p>
+    <w:p>
+      <w:pPr>
+        <w:rPr>
+          <w:b/>
+          <w:bCs/>
+        </w:rPr>
+      </w:pPr>
+      <w:r>
+        <w:rPr>
+          <w:b/>
+          <w:bCs/>
+        </w:rPr>
+        <w:t>57. Customers with at least one order</w:t>
+      </w:r>
+    </w:p>
+    <w:p>
+      <w:r>
+        <w:t>SELECT *</w:t>
+      </w:r>
+      <w:r>
+        <w:br/>
+        <w:t>FROM customers</w:t>
+      </w:r>
+      <w:r>
+        <w:br/>
+        <w:t>WHERE customer_id IN (</w:t>
+      </w:r>
+      <w:r>
+        <w:br/>
+        <w:t xml:space="preserve">    SELECT customer_id</w:t>
+      </w:r>
+      <w:r>
+        <w:br/>
+        <w:t xml:space="preserve">    FROM orders</w:t>
+      </w:r>
+      <w:r>
+        <w:br/>
+        <w:t>);</w:t>
+      </w:r>
+    </w:p>
+    <w:p>
+      <w:pPr>
+        <w:rPr>
+          <w:b/>
+          <w:bCs/>
+        </w:rPr>
+      </w:pPr>
+      <w:r>
+        <w:rPr>
+          <w:b/>
+          <w:bCs/>
+        </w:rPr>
+        <w:t>58. Customers with no orders</w:t>
+      </w:r>
+    </w:p>
+    <w:p>
+      <w:r>
+        <w:t>SELECT *</w:t>
+      </w:r>
+      <w:r>
+        <w:br/>
+        <w:t>FROM customers</w:t>
+      </w:r>
+      <w:r>
+        <w:br/>
+        <w:t>WHERE customer_id NOT IN (</w:t>
+      </w:r>
+      <w:r>
+        <w:br/>
+        <w:t xml:space="preserve">    SELECT customer_id</w:t>
+      </w:r>
+      <w:r>
+        <w:br/>
+        <w:t xml:space="preserve">    FROM orders</w:t>
+      </w:r>
+      <w:r>
+        <w:br/>
+        <w:t>);</w:t>
+      </w:r>
+    </w:p>
+    <w:p>
+      <w:pPr>
+        <w:rPr>
+          <w:b/>
+          <w:bCs/>
+        </w:rPr>
+      </w:pPr>
+      <w:r>
+        <w:rPr>
+          <w:b/>
+          <w:bCs/>
+        </w:rPr>
+        <w:t>59. Orders with highest amount</w:t>
+      </w:r>
+    </w:p>
+    <w:p>
+      <w:r>
+        <w:t>SELECT *</w:t>
+      </w:r>
+      <w:r>
+        <w:br/>
+        <w:t>FROM orders</w:t>
+      </w:r>
+      <w:r>
+        <w:br/>
+        <w:t>WHERE amount = (</w:t>
+      </w:r>
+      <w:r>
+        <w:br/>
+        <w:t xml:space="preserve">    SELECT MAX(amount)</w:t>
+      </w:r>
+      <w:r>
+        <w:br/>
+      </w:r>
+      <w:r>
+        <w:lastRenderedPageBreak/>
+        <w:t xml:space="preserve">    FROM orders</w:t>
+      </w:r>
+      <w:r>
+        <w:br/>
+        <w:t>);</w:t>
+      </w:r>
+    </w:p>
+    <w:p>
+      <w:pPr>
+        <w:rPr>
+          <w:b/>
+          <w:bCs/>
+        </w:rPr>
+      </w:pPr>
+      <w:r>
+        <w:rPr>
+          <w:b/>
+          <w:bCs/>
+        </w:rPr>
+        <w:t>60. Employees whose salary is above department minimum</w:t>
+      </w:r>
+    </w:p>
+    <w:p>
+      <w:r>
+        <w:t>SELECT *</w:t>
+      </w:r>
+      <w:r>
+        <w:br/>
         <w:t>FROM employees e</w:t>
       </w:r>
       <w:r>
         <w:br/>
-        <w:t>WHERE salary &gt; (</w:t>
-      </w:r>
-      <w:r>
-        <w:br/>
-        <w:t xml:space="preserve">    SELECT AVG(salary)</w:t>
-      </w:r>
-      <w:r>
-        <w:br/>
-        <w:t xml:space="preserve">    FROM employees</w:t>
-      </w:r>
-      <w:r>
-        <w:br/>
-        <w:t xml:space="preserve">    WHERE dept = e.dept</w:t>
-      </w:r>
-      <w:r>
-        <w:br/>
-        <w:t>);</w:t>
-      </w:r>
-    </w:p>
-    <w:p>
-      <w:pPr>
-        <w:rPr>
-          <w:b/>
-          <w:bCs/>
-        </w:rPr>
-      </w:pPr>
-      <w:r>
-        <w:rPr>
-          <w:b/>
-          <w:bCs/>
-        </w:rPr>
-        <w:t>52. Departments with highest average salary</w:t>
-      </w:r>
-    </w:p>
-    <w:p>
-      <w:r>
-        <w:t>SELECT dept</w:t>
-      </w:r>
-      <w:r>
-        <w:br/>
-        <w:t>FROM employees</w:t>
-      </w:r>
-      <w:r>
-        <w:br/>
-        <w:t>GROUP BY dept</w:t>
-      </w:r>
-      <w:r>
-        <w:br/>
-        <w:t>ORDER BY AVG(salary) DESC</w:t>
-      </w:r>
-      <w:r>
-        <w:br/>
-        <w:t>LIMIT 1;</w:t>
-      </w:r>
-    </w:p>
-    <w:p>
-      <w:pPr>
-        <w:rPr>
-          <w:b/>
-          <w:bCs/>
-        </w:rPr>
-      </w:pPr>
-      <w:r>
-        <w:rPr>
-          <w:b/>
-          <w:bCs/>
-        </w:rPr>
-        <w:t>53. Customers with orders above average order value</w:t>
-      </w:r>
-    </w:p>
-    <w:p>
-      <w:r>
-        <w:t>SELECT *</w:t>
-      </w:r>
-      <w:r>
-        <w:br/>
-        <w:t>FROM orders</w:t>
-      </w:r>
-      <w:r>
-        <w:br/>
-        <w:t>WHERE amount &gt; (</w:t>
-      </w:r>
-      <w:r>
-        <w:br/>
-        <w:t xml:space="preserve">    SELECT AVG(amount)</w:t>
-      </w:r>
-      <w:r>
-        <w:br/>
-        <w:t xml:space="preserve">    FROM orders</w:t>
-      </w:r>
-      <w:r>
-        <w:br/>
-        <w:t>);</w:t>
-      </w:r>
-    </w:p>
-    <w:p>
-      <w:pPr>
-        <w:rPr>
-          <w:b/>
-          <w:bCs/>
-        </w:rPr>
-      </w:pPr>
-      <w:r>
-        <w:rPr>
-          <w:b/>
-          <w:bCs/>
-        </w:rPr>
-        <w:t>54. Customers with highest purchase</w:t>
-      </w:r>
-    </w:p>
-    <w:p>
-      <w:r>
-        <w:t>SELECT customer_id</w:t>
-      </w:r>
-      <w:r>
-        <w:br/>
-        <w:t>FROM orders</w:t>
-      </w:r>
-      <w:r>
-        <w:br/>
-        <w:t>GROUP BY customer_id</w:t>
-      </w:r>
-      <w:r>
-        <w:br/>
-        <w:t>ORDER BY SUM(amount) DESC</w:t>
-      </w:r>
-      <w:r>
-        <w:br/>
-        <w:t>LIMIT 1;</w:t>
-      </w:r>
-    </w:p>
-    <w:p>
-      <w:pPr>
-        <w:rPr>
-          <w:b/>
-          <w:bCs/>
-        </w:rPr>
-      </w:pPr>
-      <w:r>
-        <w:rPr>
-          <w:b/>
-          <w:bCs/>
-        </w:rPr>
-        <w:t>55. Employees hired after company average hire date</w:t>
-      </w:r>
-    </w:p>
-    <w:p>
-      <w:r>
-        <w:t>SELECT *</w:t>
-      </w:r>
-      <w:r>
-        <w:br/>
-        <w:t>FROM employees</w:t>
-      </w:r>
-      <w:r>
-        <w:br/>
-        <w:t>WHERE hire_date &gt; (</w:t>
-      </w:r>
-      <w:r>
-        <w:br/>
-        <w:t xml:space="preserve">    SELECT AVG(hire_date)</w:t>
-      </w:r>
-      <w:r>
-        <w:br/>
-      </w:r>
-      <w:r>
-        <w:lastRenderedPageBreak/>
-        <w:t xml:space="preserve">    FROM employees</w:t>
-      </w:r>
-      <w:r>
-        <w:br/>
-        <w:t>);</w:t>
-      </w:r>
-    </w:p>
-    <w:p>
-      <w:pPr>
-        <w:rPr>
-          <w:b/>
-          <w:bCs/>
-        </w:rPr>
-      </w:pPr>
-      <w:r>
-        <w:rPr>
-          <w:b/>
-          <w:bCs/>
-        </w:rPr>
-        <w:t>56. Employees earning more than department maximum of another department</w:t>
-      </w:r>
-    </w:p>
-    <w:p>
-      <w:r>
-        <w:t>SELECT *</w:t>
-      </w:r>
-      <w:r>
-        <w:br/>
-        <w:t>FROM employees</w:t>
-      </w:r>
-      <w:r>
-        <w:br/>
-        <w:t>WHERE salary &gt; (</w:t>
-      </w:r>
-      <w:r>
-        <w:br/>
-        <w:t xml:space="preserve">    SELECT MAX(salary)</w:t>
-      </w:r>
-      <w:r>
-        <w:br/>
-        <w:t xml:space="preserve">    FROM employees</w:t>
-      </w:r>
-      <w:r>
-        <w:br/>
-        <w:t xml:space="preserve">    WHERE dept = 'HR'</w:t>
-      </w:r>
-      <w:r>
-        <w:br/>
-        <w:t>);</w:t>
-      </w:r>
-    </w:p>
-    <w:p>
-      <w:pPr>
-        <w:rPr>
-          <w:b/>
-          <w:bCs/>
-        </w:rPr>
-      </w:pPr>
-      <w:r>
-        <w:rPr>
-          <w:b/>
-          <w:bCs/>
-        </w:rPr>
-        <w:t>57. Customers with at least one order</w:t>
-      </w:r>
-    </w:p>
-    <w:p>
-      <w:r>
-        <w:t>SELECT *</w:t>
-      </w:r>
-      <w:r>
-        <w:br/>
-        <w:t>FROM customers</w:t>
-      </w:r>
-      <w:r>
-        <w:br/>
-        <w:t>WHERE customer_id IN (</w:t>
-      </w:r>
-      <w:r>
-        <w:br/>
-        <w:t xml:space="preserve">    SELECT customer_id</w:t>
-      </w:r>
-      <w:r>
-        <w:br/>
-        <w:t xml:space="preserve">    FROM orders</w:t>
-      </w:r>
-      <w:r>
-        <w:br/>
-        <w:t>);</w:t>
-      </w:r>
-    </w:p>
-    <w:p>
-      <w:pPr>
-        <w:rPr>
-          <w:b/>
-          <w:bCs/>
-        </w:rPr>
-      </w:pPr>
-      <w:r>
-        <w:rPr>
-          <w:b/>
-          <w:bCs/>
-        </w:rPr>
-        <w:t>58. Customers with no orders</w:t>
-      </w:r>
-    </w:p>
-    <w:p>
-      <w:r>
-        <w:t>SELECT *</w:t>
-      </w:r>
-      <w:r>
-        <w:br/>
-        <w:t>FROM customers</w:t>
-      </w:r>
-      <w:r>
-        <w:br/>
-        <w:t>WHERE customer_id NOT IN (</w:t>
-      </w:r>
-      <w:r>
-        <w:br/>
-        <w:t xml:space="preserve">    SELECT customer_id</w:t>
-      </w:r>
-      <w:r>
-        <w:br/>
-        <w:t xml:space="preserve">    FROM orders</w:t>
-      </w:r>
-      <w:r>
-        <w:br/>
-        <w:t>);</w:t>
-      </w:r>
-    </w:p>
-    <w:p>
-      <w:pPr>
-        <w:rPr>
-          <w:b/>
-          <w:bCs/>
-        </w:rPr>
-      </w:pPr>
-      <w:r>
-        <w:rPr>
-          <w:b/>
-          <w:bCs/>
-        </w:rPr>
-        <w:t>59. Orders with highest amount</w:t>
-      </w:r>
-    </w:p>
-    <w:p>
-      <w:r>
-        <w:t>SELECT *</w:t>
-      </w:r>
-      <w:r>
-        <w:br/>
-        <w:t>FROM orders</w:t>
-      </w:r>
-      <w:r>
-        <w:br/>
-        <w:t>WHERE amount = (</w:t>
-      </w:r>
-      <w:r>
-        <w:br/>
-        <w:t xml:space="preserve">    SELECT MAX(amount)</w:t>
-      </w:r>
-      <w:r>
-        <w:br/>
-        <w:t xml:space="preserve">    FROM orders</w:t>
-      </w:r>
-      <w:r>
-        <w:br/>
-        <w:t>);</w:t>
-      </w:r>
-    </w:p>
-    <w:p>
-      <w:pPr>
-        <w:rPr>
-          <w:b/>
-          <w:bCs/>
-        </w:rPr>
-      </w:pPr>
-      <w:r>
-        <w:rPr>
-          <w:b/>
-          <w:bCs/>
-        </w:rPr>
-        <w:t>60. Employees whose salary is above department minimum</w:t>
-      </w:r>
-    </w:p>
-    <w:p>
-      <w:r>
-        <w:t>SELECT *</w:t>
-      </w:r>
-      <w:r>
-        <w:br/>
-        <w:t>FROM employees e</w:t>
-      </w:r>
-      <w:r>
-        <w:br/>
         <w:t>WHERE salary &gt;</w:t>
       </w:r>
       <w:r>
@@ -3413,9 +3439,6 @@
       </w:r>
       <w:r>
         <w:br/>
-      </w:r>
-      <w:r>
-        <w:lastRenderedPageBreak/>
         <w:t>SELECT MIN(salary)</w:t>
       </w:r>
       <w:r>
@@ -3743,6 +3766,7 @@
           <w:b/>
           <w:bCs/>
         </w:rPr>
+        <w:lastRenderedPageBreak/>
         <w:t>62. Rank employees by salary</w:t>
       </w:r>
     </w:p>
@@ -3776,7 +3800,6 @@
     </w:p>
     <w:p>
       <w:r>
-        <w:lastRenderedPageBreak/>
         <w:t>SELECT emp_id, name, salary,</w:t>
       </w:r>
       <w:r>
@@ -3959,6 +3982,9 @@
       </w:r>
       <w:r>
         <w:br/>
+      </w:r>
+      <w:r>
+        <w:lastRenderedPageBreak/>
         <w:t xml:space="preserve">    FROM employees</w:t>
       </w:r>
       <w:r>
@@ -3987,7 +4013,6 @@
     </w:p>
     <w:p>
       <w:r>
-        <w:lastRenderedPageBreak/>
         <w:t>DELETE FROM employees</w:t>
       </w:r>
       <w:r>
@@ -4177,6 +4202,7 @@
           <w:b/>
           <w:bCs/>
         </w:rPr>
+        <w:lastRenderedPageBreak/>
         <w:t>72. Running sales per day</w:t>
       </w:r>
     </w:p>
@@ -4205,7 +4231,6 @@
           <w:b/>
           <w:bCs/>
         </w:rPr>
-        <w:lastRenderedPageBreak/>
         <w:t>73. Running sales per customer</w:t>
       </w:r>
     </w:p>
@@ -4401,6 +4426,7 @@
     </w:p>
     <w:p>
       <w:r>
+        <w:lastRenderedPageBreak/>
         <w:t>SELECT order_date,</w:t>
       </w:r>
       <w:r>
@@ -4429,7 +4455,6 @@
     </w:p>
     <w:p>
       <w:r>
-        <w:lastRenderedPageBreak/>
         <w:t>SELECT customer_id, order_date, amount,</w:t>
       </w:r>
       <w:r>
@@ -4642,6 +4667,7 @@
     </w:p>
     <w:p>
       <w:r>
+        <w:lastRenderedPageBreak/>
         <w:t>SELECT *</w:t>
       </w:r>
       <w:r>
@@ -4654,177 +4680,177 @@
       </w:r>
       <w:r>
         <w:br/>
+        <w:t xml:space="preserve">    FROM orders</w:t>
+      </w:r>
+      <w:r>
+        <w:br/>
+        <w:t>) t</w:t>
+      </w:r>
+      <w:r>
+        <w:br/>
+        <w:t>WHERE rn = 1;</w:t>
+      </w:r>
+    </w:p>
+    <w:p>
+      <w:pPr>
+        <w:rPr>
+          <w:b/>
+          <w:bCs/>
+        </w:rPr>
+      </w:pPr>
+      <w:r>
+        <w:rPr>
+          <w:b/>
+          <w:bCs/>
+        </w:rPr>
+        <w:t>87. Find last order per customer</w:t>
+      </w:r>
+    </w:p>
+    <w:p>
+      <w:r>
+        <w:t>SELECT *</w:t>
+      </w:r>
+      <w:r>
+        <w:br/>
+        <w:t>FROM (</w:t>
+      </w:r>
+      <w:r>
+        <w:br/>
+        <w:t xml:space="preserve">    SELECT *, ROW_NUMBER() OVER(PARTITION BY customer_id ORDER BY order_date DESC) rn</w:t>
+      </w:r>
+      <w:r>
+        <w:br/>
+        <w:t xml:space="preserve">    FROM orders</w:t>
+      </w:r>
+      <w:r>
+        <w:br/>
+        <w:t>) t</w:t>
+      </w:r>
+      <w:r>
+        <w:br/>
+        <w:t>WHERE rn = 1;</w:t>
+      </w:r>
+    </w:p>
+    <w:p>
+      <w:pPr>
+        <w:rPr>
+          <w:b/>
+          <w:bCs/>
+        </w:rPr>
+      </w:pPr>
+      <w:r>
+        <w:rPr>
+          <w:b/>
+          <w:bCs/>
+        </w:rPr>
+        <w:t>88. Top order amount per customer</w:t>
+      </w:r>
+    </w:p>
+    <w:p>
+      <w:r>
+        <w:t>SELECT *</w:t>
+      </w:r>
+      <w:r>
+        <w:br/>
+        <w:t>FROM (</w:t>
+      </w:r>
+      <w:r>
+        <w:br/>
+        <w:t xml:space="preserve">    SELECT *, RANK() OVER(PARTITION BY customer_id ORDER BY amount DESC) rnk</w:t>
+      </w:r>
+      <w:r>
+        <w:br/>
+        <w:t xml:space="preserve">    FROM orders</w:t>
+      </w:r>
+      <w:r>
+        <w:br/>
+        <w:t>) t</w:t>
+      </w:r>
+      <w:r>
+        <w:br/>
+        <w:t>WHERE rnk = 1;</w:t>
+      </w:r>
+    </w:p>
+    <w:p>
+      <w:pPr>
+        <w:rPr>
+          <w:b/>
+          <w:bCs/>
+        </w:rPr>
+      </w:pPr>
+      <w:r>
+        <w:rPr>
+          <w:b/>
+          <w:bCs/>
+        </w:rPr>
+        <w:t>89. Most recent record per employee</w:t>
+      </w:r>
+    </w:p>
+    <w:p>
+      <w:r>
+        <w:t>SELECT *</w:t>
+      </w:r>
+      <w:r>
+        <w:br/>
+        <w:t>FROM (</w:t>
+      </w:r>
+      <w:r>
+        <w:br/>
+        <w:t xml:space="preserve">    SELECT *, ROW_NUMBER() OVER(PARTITION BY emp_id ORDER BY hire_date DESC) rn</w:t>
+      </w:r>
+      <w:r>
+        <w:br/>
+        <w:t xml:space="preserve">    FROM employees</w:t>
+      </w:r>
+      <w:r>
+        <w:br/>
+        <w:t>) t</w:t>
+      </w:r>
+      <w:r>
+        <w:br/>
+        <w:t>WHERE rn = 1;</w:t>
+      </w:r>
+    </w:p>
+    <w:p>
+      <w:pPr>
+        <w:rPr>
+          <w:b/>
+          <w:bCs/>
+        </w:rPr>
+      </w:pPr>
+      <w:r>
+        <w:rPr>
+          <w:b/>
+          <w:bCs/>
+        </w:rPr>
+        <w:t>90. Find employees above department average</w:t>
+      </w:r>
+    </w:p>
+    <w:p>
+      <w:r>
+        <w:t>SELECT *</w:t>
+      </w:r>
+      <w:r>
+        <w:br/>
+        <w:t>FROM (</w:t>
+      </w:r>
+      <w:r>
+        <w:br/>
+        <w:t xml:space="preserve">    SELECT name, dept, salary,</w:t>
+      </w:r>
+      <w:r>
+        <w:br/>
+        <w:t xml:space="preserve">           AVG(salary) OVER(PARTITION BY dept) avg_sal</w:t>
+      </w:r>
+      <w:r>
+        <w:br/>
+        <w:t xml:space="preserve">    FROM employees</w:t>
+      </w:r>
+      <w:r>
+        <w:br/>
       </w:r>
       <w:r>
         <w:lastRenderedPageBreak/>
-        <w:t xml:space="preserve">    FROM orders</w:t>
-      </w:r>
-      <w:r>
-        <w:br/>
-        <w:t>) t</w:t>
-      </w:r>
-      <w:r>
-        <w:br/>
-        <w:t>WHERE rn = 1;</w:t>
-      </w:r>
-    </w:p>
-    <w:p>
-      <w:pPr>
-        <w:rPr>
-          <w:b/>
-          <w:bCs/>
-        </w:rPr>
-      </w:pPr>
-      <w:r>
-        <w:rPr>
-          <w:b/>
-          <w:bCs/>
-        </w:rPr>
-        <w:t>87. Find last order per customer</w:t>
-      </w:r>
-    </w:p>
-    <w:p>
-      <w:r>
-        <w:t>SELECT *</w:t>
-      </w:r>
-      <w:r>
-        <w:br/>
-        <w:t>FROM (</w:t>
-      </w:r>
-      <w:r>
-        <w:br/>
-        <w:t xml:space="preserve">    SELECT *, ROW_NUMBER() OVER(PARTITION BY customer_id ORDER BY order_date DESC) rn</w:t>
-      </w:r>
-      <w:r>
-        <w:br/>
-        <w:t xml:space="preserve">    FROM orders</w:t>
-      </w:r>
-      <w:r>
-        <w:br/>
-        <w:t>) t</w:t>
-      </w:r>
-      <w:r>
-        <w:br/>
-        <w:t>WHERE rn = 1;</w:t>
-      </w:r>
-    </w:p>
-    <w:p>
-      <w:pPr>
-        <w:rPr>
-          <w:b/>
-          <w:bCs/>
-        </w:rPr>
-      </w:pPr>
-      <w:r>
-        <w:rPr>
-          <w:b/>
-          <w:bCs/>
-        </w:rPr>
-        <w:t>88. Top order amount per customer</w:t>
-      </w:r>
-    </w:p>
-    <w:p>
-      <w:r>
-        <w:t>SELECT *</w:t>
-      </w:r>
-      <w:r>
-        <w:br/>
-        <w:t>FROM (</w:t>
-      </w:r>
-      <w:r>
-        <w:br/>
-        <w:t xml:space="preserve">    SELECT *, RANK() OVER(PARTITION BY customer_id ORDER BY amount DESC) rnk</w:t>
-      </w:r>
-      <w:r>
-        <w:br/>
-        <w:t xml:space="preserve">    FROM orders</w:t>
-      </w:r>
-      <w:r>
-        <w:br/>
-        <w:t>) t</w:t>
-      </w:r>
-      <w:r>
-        <w:br/>
-        <w:t>WHERE rnk = 1;</w:t>
-      </w:r>
-    </w:p>
-    <w:p>
-      <w:pPr>
-        <w:rPr>
-          <w:b/>
-          <w:bCs/>
-        </w:rPr>
-      </w:pPr>
-      <w:r>
-        <w:rPr>
-          <w:b/>
-          <w:bCs/>
-        </w:rPr>
-        <w:t>89. Most recent record per employee</w:t>
-      </w:r>
-    </w:p>
-    <w:p>
-      <w:r>
-        <w:t>SELECT *</w:t>
-      </w:r>
-      <w:r>
-        <w:br/>
-        <w:t>FROM (</w:t>
-      </w:r>
-      <w:r>
-        <w:br/>
-        <w:t xml:space="preserve">    SELECT *, ROW_NUMBER() OVER(PARTITION BY emp_id ORDER BY hire_date DESC) rn</w:t>
-      </w:r>
-      <w:r>
-        <w:br/>
-        <w:t xml:space="preserve">    FROM employees</w:t>
-      </w:r>
-      <w:r>
-        <w:br/>
-        <w:t>) t</w:t>
-      </w:r>
-      <w:r>
-        <w:br/>
-        <w:t>WHERE rn = 1;</w:t>
-      </w:r>
-    </w:p>
-    <w:p>
-      <w:pPr>
-        <w:rPr>
-          <w:b/>
-          <w:bCs/>
-        </w:rPr>
-      </w:pPr>
-      <w:r>
-        <w:rPr>
-          <w:b/>
-          <w:bCs/>
-        </w:rPr>
-        <w:t>90. Find employees above department average</w:t>
-      </w:r>
-    </w:p>
-    <w:p>
-      <w:r>
-        <w:t>SELECT *</w:t>
-      </w:r>
-      <w:r>
-        <w:br/>
-        <w:t>FROM (</w:t>
-      </w:r>
-      <w:r>
-        <w:br/>
-        <w:t xml:space="preserve">    SELECT name, dept, salary,</w:t>
-      </w:r>
-      <w:r>
-        <w:br/>
-        <w:t xml:space="preserve">           AVG(salary) OVER(PARTITION BY dept) avg_sal</w:t>
-      </w:r>
-      <w:r>
-        <w:br/>
-        <w:t xml:space="preserve">    FROM employees</w:t>
-      </w:r>
-      <w:r>
-        <w:br/>
         <w:t>) t</w:t>
       </w:r>
       <w:r>
@@ -4866,7 +4892,6 @@
           <w:b/>
           <w:bCs/>
         </w:rPr>
-        <w:lastRenderedPageBreak/>
         <w:t>91. Divide employees into 4 salary groups</w:t>
       </w:r>
     </w:p>
@@ -5061,6 +5086,7 @@
           <w:b/>
           <w:bCs/>
         </w:rPr>
+        <w:lastRenderedPageBreak/>
         <w:t>96. Find second order per customer</w:t>
       </w:r>
     </w:p>
@@ -5078,9 +5104,6 @@
       </w:r>
       <w:r>
         <w:br/>
-      </w:r>
-      <w:r>
-        <w:lastRenderedPageBreak/>
         <w:t xml:space="preserve">    FROM orders</w:t>
       </w:r>
       <w:r>
@@ -5288,7 +5311,6 @@
     </w:p>
     <w:p>
       <w:r>
-        <w:lastRenderedPageBreak/>
         <w:t>Example tables used:</w:t>
       </w:r>
     </w:p>
@@ -5467,6 +5489,9 @@
       </w:r>
       <w:r>
         <w:br/>
+      </w:r>
+      <w:r>
+        <w:lastRenderedPageBreak/>
         <w:t xml:space="preserve">    FROM logins</w:t>
       </w:r>
       <w:r>
@@ -5501,7 +5526,6 @@
           <w:b/>
           <w:bCs/>
         </w:rPr>
-        <w:lastRenderedPageBreak/>
         <w:t>124. Find longest consecutive login streak</w:t>
       </w:r>
     </w:p>
@@ -5678,6 +5702,7 @@
           <w:b/>
           <w:bCs/>
         </w:rPr>
+        <w:lastRenderedPageBreak/>
         <w:t>126. Customer first purchase date</w:t>
       </w:r>
     </w:p>
@@ -5700,7 +5725,6 @@
     </w:p>
     <w:p>
       <w:r>
-        <w:lastRenderedPageBreak/>
         <w:pict w14:anchorId="1762757F">
           <v:rect id="_x0000_i1048" style="width:0;height:1.5pt" o:hralign="center" o:hrstd="t" o:hr="t" fillcolor="#a0a0a0" stroked="f"/>
         </w:pict>
@@ -5880,6 +5904,9 @@
       </w:r>
       <w:r>
         <w:br/>
+      </w:r>
+      <w:r>
+        <w:lastRenderedPageBreak/>
         <w:t>GROUP BY sale_date</w:t>
       </w:r>
       <w:r>
@@ -5915,7 +5942,6 @@
     </w:p>
     <w:p>
       <w:r>
-        <w:lastRenderedPageBreak/>
         <w:t>SELECT customer_id,</w:t>
       </w:r>
       <w:r>
@@ -6109,6 +6135,7 @@
           <w:b/>
           <w:bCs/>
         </w:rPr>
+        <w:lastRenderedPageBreak/>
         <w:t>134. Pivot monthly sales</w:t>
       </w:r>
     </w:p>
@@ -6130,9 +6157,6 @@
       </w:r>
       <w:r>
         <w:br/>
-      </w:r>
-      <w:r>
-        <w:lastRenderedPageBreak/>
         <w:t>FROM sales</w:t>
       </w:r>
       <w:r>
@@ -6331,6 +6355,7 @@
     </w:p>
     <w:p>
       <w:r>
+        <w:lastRenderedPageBreak/>
         <w:t>DELETE FROM sales</w:t>
       </w:r>
       <w:r>
@@ -6351,9 +6376,6 @@
       </w:r>
       <w:r>
         <w:br/>
-      </w:r>
-      <w:r>
-        <w:lastRenderedPageBreak/>
         <w:t xml:space="preserve">               ROW_NUMBER() OVER(</w:t>
       </w:r>
       <w:r>
@@ -6534,6 +6556,9 @@
       </w:r>
       <w:r>
         <w:br/>
+      </w:r>
+      <w:r>
+        <w:lastRenderedPageBreak/>
         <w:t xml:space="preserve">           SUM(amount) revenue</w:t>
       </w:r>
       <w:r>
@@ -6568,7 +6593,6 @@
           <w:b/>
           <w:bCs/>
         </w:rPr>
-        <w:lastRenderedPageBreak/>
         <w:t>142. Percentage growth</w:t>
       </w:r>
     </w:p>
@@ -6757,6 +6781,7 @@
     </w:p>
     <w:p>
       <w:r>
+        <w:lastRenderedPageBreak/>
         <w:t>SELECT DISTINCT s1.customer_id</w:t>
       </w:r>
       <w:r>
@@ -6773,9 +6798,6 @@
       </w:r>
       <w:r>
         <w:br/>
-      </w:r>
-      <w:r>
-        <w:lastRenderedPageBreak/>
         <w:t>AND DATE_TRUNC('month', s1.sale_date) + INTERVAL '1 month'</w:t>
       </w:r>
       <w:r>
@@ -6954,6 +6976,7 @@
           <w:b/>
           <w:bCs/>
         </w:rPr>
+        <w:lastRenderedPageBreak/>
         <w:t>Set-4: Hard SQL Interview Questions with Solutions (171–220)</w:t>
       </w:r>
       <w:r>
@@ -7002,7 +7025,6 @@
           <w:b/>
           <w:bCs/>
         </w:rPr>
-        <w:lastRenderedPageBreak/>
         <w:t>events</w:t>
       </w:r>
     </w:p>
@@ -7183,6 +7205,7 @@
           <w:b/>
           <w:bCs/>
         </w:rPr>
+        <w:lastRenderedPageBreak/>
         <w:t>173. Find employee hierarchy</w:t>
       </w:r>
     </w:p>
@@ -7207,9 +7230,6 @@
       </w:r>
       <w:r>
         <w:br/>
-      </w:r>
-      <w:r>
-        <w:lastRenderedPageBreak/>
         <w:t xml:space="preserve">    UNION ALL</w:t>
       </w:r>
       <w:r>
@@ -7409,6 +7429,7 @@
           <w:b/>
           <w:bCs/>
         </w:rPr>
+        <w:lastRenderedPageBreak/>
         <w:t>176. Moving average of sales (3 days window)</w:t>
       </w:r>
     </w:p>
@@ -7430,9 +7451,6 @@
       </w:r>
       <w:r>
         <w:br/>
-      </w:r>
-      <w:r>
-        <w:lastRenderedPageBreak/>
         <w:t xml:space="preserve">       ) moving_avg</w:t>
       </w:r>
       <w:r>
@@ -7611,6 +7629,9 @@
       </w:r>
       <w:r>
         <w:br/>
+      </w:r>
+      <w:r>
+        <w:lastRenderedPageBreak/>
         <w:t xml:space="preserve">    ON e.manager_id = h.emp_id</w:t>
       </w:r>
       <w:r>
@@ -7645,7 +7666,6 @@
           <w:b/>
           <w:bCs/>
         </w:rPr>
-        <w:lastRenderedPageBreak/>
         <w:t>180. Find root manager for every employee</w:t>
       </w:r>
     </w:p>
@@ -7810,6 +7830,9 @@
       </w:r>
       <w:r>
         <w:br/>
+      </w:r>
+      <w:r>
+        <w:lastRenderedPageBreak/>
         <w:t xml:space="preserve">        PARTITION BY user_id</w:t>
       </w:r>
       <w:r>
@@ -7835,7 +7858,6 @@
     </w:p>
     <w:p>
       <w:r>
-        <w:lastRenderedPageBreak/>
         <w:pict w14:anchorId="2DCABD33">
           <v:rect id="_x0000_i1084" style="width:0;height:1.5pt" o:hralign="center" o:hrstd="t" o:hr="t" fillcolor="#a0a0a0" stroked="f"/>
         </w:pict>
@@ -8014,6 +8036,7 @@
           <w:b/>
           <w:bCs/>
         </w:rPr>
+        <w:lastRenderedPageBreak/>
         <w:t>185. Best selling product per week</w:t>
       </w:r>
     </w:p>
@@ -8039,9 +8062,6 @@
       </w:r>
       <w:r>
         <w:br/>
-      </w:r>
-      <w:r>
-        <w:lastRenderedPageBreak/>
         <w:t xml:space="preserve">           RANK() OVER(</w:t>
       </w:r>
       <w:r>
@@ -8239,6 +8259,7 @@
           <w:b/>
           <w:bCs/>
         </w:rPr>
+        <w:lastRenderedPageBreak/>
         <w:t>189. Top revenue day</w:t>
       </w:r>
     </w:p>
@@ -8256,9 +8277,6 @@
       </w:r>
       <w:r>
         <w:br/>
-      </w:r>
-      <w:r>
-        <w:lastRenderedPageBreak/>
         <w:t>ORDER BY SUM(amount) DESC</w:t>
       </w:r>
       <w:r>
@@ -8450,6 +8468,9 @@
       </w:r>
       <w:r>
         <w:br/>
+      </w:r>
+      <w:r>
+        <w:lastRenderedPageBreak/>
         <w:t xml:space="preserve">    SELECT customer_id,</w:t>
       </w:r>
       <w:r>
@@ -8470,9 +8491,6 @@
       </w:r>
       <w:r>
         <w:br/>
-      </w:r>
-      <w:r>
-        <w:lastRenderedPageBreak/>
         <w:t>WHERE DATE_TRUNC('month', first_purchase) =</w:t>
       </w:r>
       <w:r>
@@ -8664,6 +8682,9 @@
       </w:r>
       <w:r>
         <w:br/>
+      </w:r>
+      <w:r>
+        <w:lastRenderedPageBreak/>
         <w:t xml:space="preserve">           ORDER BY order_date</w:t>
       </w:r>
       <w:r>
@@ -8694,7 +8715,6 @@
           <w:b/>
           <w:bCs/>
         </w:rPr>
-        <w:lastRenderedPageBreak/>
         <w:t>198. Time between consecutive events</w:t>
       </w:r>
     </w:p>
@@ -8865,6 +8885,7 @@
     </w:p>
     <w:p>
       <w:r>
+        <w:lastRenderedPageBreak/>
         <w:t xml:space="preserve">For </w:t>
       </w:r>
       <w:r>
@@ -8919,7 +8940,6 @@
         </w:numPr>
       </w:pPr>
       <w:r>
-        <w:lastRenderedPageBreak/>
         <w:t>Ranking problems</w:t>
       </w:r>
     </w:p>
@@ -9116,9 +9136,9 @@
     </w:lvl>
   </w:abstractNum>
   <w:abstractNum w:abstractNumId="1" w15:restartNumberingAfterBreak="0">
-    <w:nsid w:val="33FC1176"/>
+    <w:nsid w:val="2DB379F5"/>
     <w:multiLevelType w:val="multilevel"/>
-    <w:tmpl w:val="1BC48150"/>
+    <w:tmpl w:val="14EAD728"/>
     <w:lvl w:ilvl="0">
       <w:start w:val="1"/>
       <w:numFmt w:val="bullet"/>
@@ -9265,9 +9285,9 @@
     </w:lvl>
   </w:abstractNum>
   <w:abstractNum w:abstractNumId="2" w15:restartNumberingAfterBreak="0">
-    <w:nsid w:val="47CB6BA7"/>
+    <w:nsid w:val="33FC1176"/>
     <w:multiLevelType w:val="multilevel"/>
-    <w:tmpl w:val="4BE045CA"/>
+    <w:tmpl w:val="1BC48150"/>
     <w:lvl w:ilvl="0">
       <w:start w:val="1"/>
       <w:numFmt w:val="bullet"/>
@@ -9414,9 +9434,9 @@
     </w:lvl>
   </w:abstractNum>
   <w:abstractNum w:abstractNumId="3" w15:restartNumberingAfterBreak="0">
-    <w:nsid w:val="61A11C51"/>
+    <w:nsid w:val="47CB6BA7"/>
     <w:multiLevelType w:val="multilevel"/>
-    <w:tmpl w:val="2B86086A"/>
+    <w:tmpl w:val="4BE045CA"/>
     <w:lvl w:ilvl="0">
       <w:start w:val="1"/>
       <w:numFmt w:val="bullet"/>
@@ -9563,9 +9583,9 @@
     </w:lvl>
   </w:abstractNum>
   <w:abstractNum w:abstractNumId="4" w15:restartNumberingAfterBreak="0">
-    <w:nsid w:val="6EBA156D"/>
+    <w:nsid w:val="61A11C51"/>
     <w:multiLevelType w:val="multilevel"/>
-    <w:tmpl w:val="70249C3C"/>
+    <w:tmpl w:val="2B86086A"/>
     <w:lvl w:ilvl="0">
       <w:start w:val="1"/>
       <w:numFmt w:val="bullet"/>
@@ -9712,6 +9732,155 @@
     </w:lvl>
   </w:abstractNum>
   <w:abstractNum w:abstractNumId="5" w15:restartNumberingAfterBreak="0">
+    <w:nsid w:val="6EBA156D"/>
+    <w:multiLevelType w:val="multilevel"/>
+    <w:tmpl w:val="70249C3C"/>
+    <w:lvl w:ilvl="0">
+      <w:start w:val="1"/>
+      <w:numFmt w:val="bullet"/>
+      <w:lvlText w:val=""/>
+      <w:lvlJc w:val="left"/>
+      <w:pPr>
+        <w:tabs>
+          <w:tab w:val="num" w:pos="720"/>
+        </w:tabs>
+        <w:ind w:left="720" w:hanging="360"/>
+      </w:pPr>
+      <w:rPr>
+        <w:rFonts w:ascii="Symbol" w:hAnsi="Symbol" w:hint="default"/>
+        <w:sz w:val="20"/>
+      </w:rPr>
+    </w:lvl>
+    <w:lvl w:ilvl="1" w:tentative="1">
+      <w:start w:val="1"/>
+      <w:numFmt w:val="bullet"/>
+      <w:lvlText w:val="o"/>
+      <w:lvlJc w:val="left"/>
+      <w:pPr>
+        <w:tabs>
+          <w:tab w:val="num" w:pos="1440"/>
+        </w:tabs>
+        <w:ind w:left="1440" w:hanging="360"/>
+      </w:pPr>
+      <w:rPr>
+        <w:rFonts w:ascii="Courier New" w:hAnsi="Courier New" w:hint="default"/>
+        <w:sz w:val="20"/>
+      </w:rPr>
+    </w:lvl>
+    <w:lvl w:ilvl="2" w:tentative="1">
+      <w:start w:val="1"/>
+      <w:numFmt w:val="bullet"/>
+      <w:lvlText w:val=""/>
+      <w:lvlJc w:val="left"/>
+      <w:pPr>
+        <w:tabs>
+          <w:tab w:val="num" w:pos="2160"/>
+        </w:tabs>
+        <w:ind w:left="2160" w:hanging="360"/>
+      </w:pPr>
+      <w:rPr>
+        <w:rFonts w:ascii="Wingdings" w:hAnsi="Wingdings" w:hint="default"/>
+        <w:sz w:val="20"/>
+      </w:rPr>
+    </w:lvl>
+    <w:lvl w:ilvl="3" w:tentative="1">
+      <w:start w:val="1"/>
+      <w:numFmt w:val="bullet"/>
+      <w:lvlText w:val=""/>
+      <w:lvlJc w:val="left"/>
+      <w:pPr>
+        <w:tabs>
+          <w:tab w:val="num" w:pos="2880"/>
+        </w:tabs>
+        <w:ind w:left="2880" w:hanging="360"/>
+      </w:pPr>
+      <w:rPr>
+        <w:rFonts w:ascii="Wingdings" w:hAnsi="Wingdings" w:hint="default"/>
+        <w:sz w:val="20"/>
+      </w:rPr>
+    </w:lvl>
+    <w:lvl w:ilvl="4" w:tentative="1">
+      <w:start w:val="1"/>
+      <w:numFmt w:val="bullet"/>
+      <w:lvlText w:val=""/>
+      <w:lvlJc w:val="left"/>
+      <w:pPr>
+        <w:tabs>
+          <w:tab w:val="num" w:pos="3600"/>
+        </w:tabs>
+        <w:ind w:left="3600" w:hanging="360"/>
+      </w:pPr>
+      <w:rPr>
+        <w:rFonts w:ascii="Wingdings" w:hAnsi="Wingdings" w:hint="default"/>
+        <w:sz w:val="20"/>
+      </w:rPr>
+    </w:lvl>
+    <w:lvl w:ilvl="5" w:tentative="1">
+      <w:start w:val="1"/>
+      <w:numFmt w:val="bullet"/>
+      <w:lvlText w:val=""/>
+      <w:lvlJc w:val="left"/>
+      <w:pPr>
+        <w:tabs>
+          <w:tab w:val="num" w:pos="4320"/>
+        </w:tabs>
+        <w:ind w:left="4320" w:hanging="360"/>
+      </w:pPr>
+      <w:rPr>
+        <w:rFonts w:ascii="Wingdings" w:hAnsi="Wingdings" w:hint="default"/>
+        <w:sz w:val="20"/>
+      </w:rPr>
+    </w:lvl>
+    <w:lvl w:ilvl="6" w:tentative="1">
+      <w:start w:val="1"/>
+      <w:numFmt w:val="bullet"/>
+      <w:lvlText w:val=""/>
+      <w:lvlJc w:val="left"/>
+      <w:pPr>
+        <w:tabs>
+          <w:tab w:val="num" w:pos="5040"/>
+        </w:tabs>
+        <w:ind w:left="5040" w:hanging="360"/>
+      </w:pPr>
+      <w:rPr>
+        <w:rFonts w:ascii="Wingdings" w:hAnsi="Wingdings" w:hint="default"/>
+        <w:sz w:val="20"/>
+      </w:rPr>
+    </w:lvl>
+    <w:lvl w:ilvl="7" w:tentative="1">
+      <w:start w:val="1"/>
+      <w:numFmt w:val="bullet"/>
+      <w:lvlText w:val=""/>
+      <w:lvlJc w:val="left"/>
+      <w:pPr>
+        <w:tabs>
+          <w:tab w:val="num" w:pos="5760"/>
+        </w:tabs>
+        <w:ind w:left="5760" w:hanging="360"/>
+      </w:pPr>
+      <w:rPr>
+        <w:rFonts w:ascii="Wingdings" w:hAnsi="Wingdings" w:hint="default"/>
+        <w:sz w:val="20"/>
+      </w:rPr>
+    </w:lvl>
+    <w:lvl w:ilvl="8" w:tentative="1">
+      <w:start w:val="1"/>
+      <w:numFmt w:val="bullet"/>
+      <w:lvlText w:val=""/>
+      <w:lvlJc w:val="left"/>
+      <w:pPr>
+        <w:tabs>
+          <w:tab w:val="num" w:pos="6480"/>
+        </w:tabs>
+        <w:ind w:left="6480" w:hanging="360"/>
+      </w:pPr>
+      <w:rPr>
+        <w:rFonts w:ascii="Wingdings" w:hAnsi="Wingdings" w:hint="default"/>
+        <w:sz w:val="20"/>
+      </w:rPr>
+    </w:lvl>
+  </w:abstractNum>
+  <w:abstractNum w:abstractNumId="6" w15:restartNumberingAfterBreak="0">
     <w:nsid w:val="7E5D120B"/>
     <w:multiLevelType w:val="multilevel"/>
     <w:tmpl w:val="ECECDF4A"/>
@@ -9825,21 +9994,24 @@
     </w:lvl>
   </w:abstractNum>
   <w:num w:numId="1" w16cid:durableId="1680572255">
-    <w:abstractNumId w:val="2"/>
+    <w:abstractNumId w:val="3"/>
   </w:num>
   <w:num w:numId="2" w16cid:durableId="1587223098">
-    <w:abstractNumId w:val="5"/>
+    <w:abstractNumId w:val="6"/>
   </w:num>
   <w:num w:numId="3" w16cid:durableId="510222254">
     <w:abstractNumId w:val="0"/>
   </w:num>
   <w:num w:numId="4" w16cid:durableId="309598658">
+    <w:abstractNumId w:val="5"/>
+  </w:num>
+  <w:num w:numId="5" w16cid:durableId="275210158">
     <w:abstractNumId w:val="4"/>
   </w:num>
-  <w:num w:numId="5" w16cid:durableId="275210158">
-    <w:abstractNumId w:val="3"/>
+  <w:num w:numId="6" w16cid:durableId="1074357068">
+    <w:abstractNumId w:val="2"/>
   </w:num>
-  <w:num w:numId="6" w16cid:durableId="1074357068">
+  <w:num w:numId="7" w16cid:durableId="1297683464">
     <w:abstractNumId w:val="1"/>
   </w:num>
 </w:numbering>
@@ -10447,7 +10619,6 @@
   <w:style w:type="character" w:default="1" w:styleId="DefaultParagraphFont">
     <w:name w:val="Default Paragraph Font"/>
     <w:uiPriority w:val="1"/>
-    <w:semiHidden/>
     <w:unhideWhenUsed/>
   </w:style>
   <w:style w:type="table" w:default="1" w:styleId="TableNormal">

</xml_diff>